<commit_message>
Fase 6.4 — Cierre, commit y publicación en Support
</commit_message>
<xml_diff>
--- a/projects/Mapa simbólico Mundial/Seguimiento.docx
+++ b/projects/Mapa simbólico Mundial/Seguimiento.docx
@@ -1,8 +1,8 @@
 
 <file path=word/document.xml><?xml version="1.0" encoding="utf-8"?>
-<w:document xmlns:wpc="http://schemas.microsoft.com/office/word/2010/wordprocessingCanvas" xmlns:cx="http://schemas.microsoft.com/office/drawing/2014/chartex" xmlns:cx1="http://schemas.microsoft.com/office/drawing/2015/9/8/chartex" xmlns:cx2="http://schemas.microsoft.com/office/drawing/2015/10/21/chartex" xmlns:cx3="http://schemas.microsoft.com/office/drawing/2016/5/9/chartex" xmlns:cx4="http://schemas.microsoft.com/office/drawing/2016/5/10/chartex" xmlns:cx5="http://schemas.microsoft.com/office/drawing/2016/5/11/chartex" xmlns:cx6="http://schemas.microsoft.com/office/drawing/2016/5/12/chartex" xmlns:cx7="http://schemas.microsoft.com/office/drawing/2016/5/13/chartex" xmlns:cx8="http://schemas.microsoft.com/office/drawing/2016/5/14/chartex" xmlns:mc="http://schemas.openxmlformats.org/markup-compatibility/2006" xmlns:aink="http://schemas.microsoft.com/office/drawing/2016/ink" xmlns:am3d="http://schemas.microsoft.com/office/drawing/2017/model3d" xmlns:o="urn:schemas-microsoft-com:office:office" xmlns:oel="http://schemas.microsoft.com/office/2019/extlst" xmlns:r="http://schemas.openxmlformats.org/officeDocument/2006/relationships" xmlns:m="http://schemas.openxmlformats.org/officeDocument/2006/math" xmlns:v="urn:schemas-microsoft-com:vml" xmlns:wp14="http://schemas.microsoft.com/office/word/2010/wordprocessingDrawing" xmlns:wp="http://schemas.openxmlformats.org/drawingml/2006/wordprocessingDrawing" xmlns:w10="urn:schemas-microsoft-com:office:word" xmlns:w="http://schemas.openxmlformats.org/wordprocessingml/2006/main" xmlns:w14="http://schemas.microsoft.com/office/word/2010/wordml" xmlns:w15="http://schemas.microsoft.com/office/word/2012/wordml" xmlns:w16cex="http://schemas.microsoft.com/office/word/2018/wordml/cex" xmlns:w16cid="http://schemas.microsoft.com/office/word/2016/wordml/cid" xmlns:w16="http://schemas.microsoft.com/office/word/2018/wordml" xmlns:w16du="http://schemas.microsoft.com/office/word/2023/wordml/word16du" xmlns:w16sdtdh="http://schemas.microsoft.com/office/word/2020/wordml/sdtdatahash" xmlns:w16sdtfl="http://schemas.microsoft.com/office/word/2024/wordml/sdtformatlock" xmlns:w16se="http://schemas.microsoft.com/office/word/2015/wordml/symex" xmlns:wpg="http://schemas.microsoft.com/office/word/2010/wordprocessingGroup" xmlns:wpi="http://schemas.microsoft.com/office/word/2010/wordprocessingInk" xmlns:wne="http://schemas.microsoft.com/office/word/2006/wordml" xmlns:wps="http://schemas.microsoft.com/office/word/2010/wordprocessingShape" mc:Ignorable="w14 w15 w16se w16cid w16 w16cex w16sdtdh w16sdtfl w16du wp14">
+<w:document xmlns:ns1="http://schemas.openxmlformats.org/markup-compatibility/2006" xmlns:ns2="http://schemas.microsoft.com/office/word/2010/wordml" xmlns:ns3="urn:schemas-microsoft-com:vml" xmlns:ns4="urn:schemas-microsoft-com:office:office" xmlns:w="http://schemas.openxmlformats.org/wordprocessingml/2006/main" ns1:Ignorable="w14 w15 w16se w16cid w16 w16cex w16sdtdh w16sdtfl w16du wp14">
   <w:body>
-    <w:p>
+    <w:p ns2:paraId="61902063" ns2:textId="77777777">
       <w:pPr>
         <w:rPr>
           <w:b/>
@@ -17,7 +17,7 @@
         <w:t>Cuadro de seguimiento — Retícula Global 2025</w:t>
       </w:r>
     </w:p>
-    <w:p>
+    <w:p ns2:paraId="713766A8" ns2:textId="77777777">
       <w:pPr>
         <w:rPr>
           <w:b/>
@@ -52,7 +52,7 @@
         <w:gridCol w:w="1779"/>
         <w:gridCol w:w="2956"/>
       </w:tblGrid>
-      <w:tr>
+      <w:tr ns2:paraId="0B98A648" ns2:textId="77777777">
         <w:trPr>
           <w:tblHeader/>
           <w:tblCellSpacing w:w="15" w:type="dxa"/>
@@ -63,7 +63,7 @@
             <w:vAlign w:val="center"/>
             <w:hideMark/>
           </w:tcPr>
-          <w:p>
+          <w:p ns2:paraId="756A1C0F" ns2:textId="77777777">
             <w:pPr>
               <w:rPr>
                 <w:b/>
@@ -87,7 +87,7 @@
             <w:vAlign w:val="center"/>
             <w:hideMark/>
           </w:tcPr>
-          <w:p>
+          <w:p ns2:paraId="02C37459" ns2:textId="77777777">
             <w:pPr>
               <w:rPr>
                 <w:b/>
@@ -111,7 +111,7 @@
             <w:vAlign w:val="center"/>
             <w:hideMark/>
           </w:tcPr>
-          <w:p>
+          <w:p ns2:paraId="1F53286A" ns2:textId="77777777">
             <w:pPr>
               <w:rPr>
                 <w:b/>
@@ -135,7 +135,7 @@
             <w:vAlign w:val="center"/>
             <w:hideMark/>
           </w:tcPr>
-          <w:p>
+          <w:p ns2:paraId="5442392F" ns2:textId="77777777">
             <w:pPr>
               <w:rPr>
                 <w:b/>
@@ -154,7 +154,7 @@
           </w:p>
         </w:tc>
       </w:tr>
-      <w:tr>
+      <w:tr ns2:paraId="382C3DFB" ns2:textId="77777777">
         <w:trPr>
           <w:tblCellSpacing w:w="15" w:type="dxa"/>
         </w:trPr>
@@ -164,7 +164,7 @@
             <w:vAlign w:val="center"/>
             <w:hideMark/>
           </w:tcPr>
-          <w:p>
+          <w:p ns2:paraId="7A2FC256" ns2:textId="77777777">
             <w:pPr>
               <w:rPr>
                 <w:strike/>
@@ -186,7 +186,7 @@
             <w:vAlign w:val="center"/>
             <w:hideMark/>
           </w:tcPr>
-          <w:p>
+          <w:p ns2:paraId="153F6790" ns2:textId="77777777">
             <w:pPr>
               <w:rPr>
                 <w:strike/>
@@ -206,7 +206,7 @@
             <w:vAlign w:val="center"/>
             <w:hideMark/>
           </w:tcPr>
-          <w:p>
+          <w:p ns2:paraId="3C74BEC7" ns2:textId="77777777">
             <w:pPr>
               <w:rPr>
                 <w:strike/>
@@ -228,7 +228,7 @@
             <w:vAlign w:val="center"/>
             <w:hideMark/>
           </w:tcPr>
-          <w:p>
+          <w:p ns2:paraId="65C7AC5C" ns2:textId="77777777">
             <w:pPr>
               <w:rPr>
                 <w:strike/>
@@ -243,7 +243,7 @@
           </w:p>
         </w:tc>
       </w:tr>
-      <w:tr>
+      <w:tr ns2:paraId="7B7B41AB" ns2:textId="77777777">
         <w:trPr>
           <w:tblCellSpacing w:w="15" w:type="dxa"/>
         </w:trPr>
@@ -253,7 +253,7 @@
             <w:vAlign w:val="center"/>
             <w:hideMark/>
           </w:tcPr>
-          <w:p>
+          <w:p ns2:paraId="1452A9FE" ns2:textId="77777777">
             <w:pPr>
               <w:rPr>
                 <w:strike/>
@@ -275,7 +275,7 @@
             <w:vAlign w:val="center"/>
             <w:hideMark/>
           </w:tcPr>
-          <w:p>
+          <w:p ns2:paraId="425026A7" ns2:textId="77777777">
             <w:pPr>
               <w:rPr>
                 <w:strike/>
@@ -295,7 +295,7 @@
             <w:vAlign w:val="center"/>
             <w:hideMark/>
           </w:tcPr>
-          <w:p>
+          <w:p ns2:paraId="17E7A30C" ns2:textId="77777777">
             <w:pPr>
               <w:rPr>
                 <w:strike/>
@@ -317,7 +317,7 @@
             <w:vAlign w:val="center"/>
             <w:hideMark/>
           </w:tcPr>
-          <w:p>
+          <w:p ns2:paraId="2C66B6B0" ns2:textId="77777777">
             <w:pPr>
               <w:rPr>
                 <w:strike/>
@@ -333,7 +333,7 @@
         </w:tc>
       </w:tr>
     </w:tbl>
-    <w:p>
+    <w:p ns2:paraId="4293451E" ns2:textId="77777777">
       <w:pPr>
         <w:rPr>
           <w:strike/>
@@ -343,12 +343,12 @@
         <w:rPr>
           <w:strike/>
         </w:rPr>
-        <w:pict w14:anchorId="7E65C799">
-          <v:rect id="_x0000_i1025" style="width:0;height:1.5pt" o:hralign="center" o:hrstd="t" o:hr="t" fillcolor="#a0a0a0" stroked="f"/>
+        <w:pict ns2:anchorId="7E65C799">
+          <ns3:rect id="_x0000_i1025" style="width:0;height:1.5pt" ns4:hralign="center" ns4:hrstd="t" ns4:hr="t" fillcolor="#a0a0a0" stroked="f"/>
         </w:pict>
       </w:r>
     </w:p>
-    <w:p>
+    <w:p ns2:paraId="26CF5D73" ns2:textId="77777777">
       <w:pPr>
         <w:rPr>
           <w:b/>
@@ -383,7 +383,7 @@
         <w:gridCol w:w="1136"/>
         <w:gridCol w:w="4240"/>
       </w:tblGrid>
-      <w:tr>
+      <w:tr ns2:paraId="05413237" ns2:textId="77777777">
         <w:trPr>
           <w:tblHeader/>
           <w:tblCellSpacing w:w="15" w:type="dxa"/>
@@ -394,7 +394,7 @@
             <w:vAlign w:val="center"/>
             <w:hideMark/>
           </w:tcPr>
-          <w:p>
+          <w:p ns2:paraId="7C40DE8A" ns2:textId="77777777">
             <w:pPr>
               <w:rPr>
                 <w:b/>
@@ -418,7 +418,7 @@
             <w:vAlign w:val="center"/>
             <w:hideMark/>
           </w:tcPr>
-          <w:p>
+          <w:p ns2:paraId="5FA64533" ns2:textId="77777777">
             <w:pPr>
               <w:rPr>
                 <w:b/>
@@ -442,7 +442,7 @@
             <w:vAlign w:val="center"/>
             <w:hideMark/>
           </w:tcPr>
-          <w:p>
+          <w:p ns2:paraId="08B9931E" ns2:textId="77777777">
             <w:pPr>
               <w:rPr>
                 <w:b/>
@@ -466,7 +466,7 @@
             <w:vAlign w:val="center"/>
             <w:hideMark/>
           </w:tcPr>
-          <w:p>
+          <w:p ns2:paraId="524D945A" ns2:textId="77777777">
             <w:pPr>
               <w:rPr>
                 <w:b/>
@@ -485,7 +485,7 @@
           </w:p>
         </w:tc>
       </w:tr>
-      <w:tr>
+      <w:tr ns2:paraId="3A76B846" ns2:textId="77777777">
         <w:trPr>
           <w:tblCellSpacing w:w="15" w:type="dxa"/>
         </w:trPr>
@@ -495,7 +495,7 @@
             <w:vAlign w:val="center"/>
             <w:hideMark/>
           </w:tcPr>
-          <w:p>
+          <w:p ns2:paraId="31302293" ns2:textId="77777777">
             <w:pPr>
               <w:rPr>
                 <w:strike/>
@@ -517,7 +517,7 @@
             <w:vAlign w:val="center"/>
             <w:hideMark/>
           </w:tcPr>
-          <w:p>
+          <w:p ns2:paraId="1EAB3CE4" ns2:textId="77777777">
             <w:pPr>
               <w:rPr>
                 <w:strike/>
@@ -537,7 +537,7 @@
             <w:vAlign w:val="center"/>
             <w:hideMark/>
           </w:tcPr>
-          <w:p>
+          <w:p ns2:paraId="2A4BC85A" ns2:textId="77777777">
             <w:pPr>
               <w:rPr>
                 <w:strike/>
@@ -559,7 +559,7 @@
             <w:vAlign w:val="center"/>
             <w:hideMark/>
           </w:tcPr>
-          <w:p>
+          <w:p ns2:paraId="3851F026" ns2:textId="77777777">
             <w:pPr>
               <w:rPr>
                 <w:strike/>
@@ -574,7 +574,7 @@
           </w:p>
         </w:tc>
       </w:tr>
-      <w:tr>
+      <w:tr ns2:paraId="644115F8" ns2:textId="77777777">
         <w:trPr>
           <w:tblCellSpacing w:w="15" w:type="dxa"/>
         </w:trPr>
@@ -584,7 +584,7 @@
             <w:vAlign w:val="center"/>
             <w:hideMark/>
           </w:tcPr>
-          <w:p>
+          <w:p ns2:paraId="7788206E" ns2:textId="77777777">
             <w:pPr>
               <w:rPr>
                 <w:strike/>
@@ -606,7 +606,7 @@
             <w:vAlign w:val="center"/>
             <w:hideMark/>
           </w:tcPr>
-          <w:p>
+          <w:p ns2:paraId="3C511558" ns2:textId="77777777">
             <w:pPr>
               <w:rPr>
                 <w:strike/>
@@ -626,7 +626,7 @@
             <w:vAlign w:val="center"/>
             <w:hideMark/>
           </w:tcPr>
-          <w:p>
+          <w:p ns2:paraId="0DACB4B4" ns2:textId="77777777">
             <w:pPr>
               <w:rPr>
                 <w:strike/>
@@ -648,7 +648,7 @@
             <w:vAlign w:val="center"/>
             <w:hideMark/>
           </w:tcPr>
-          <w:p>
+          <w:p ns2:paraId="359D07CD" ns2:textId="77777777">
             <w:pPr>
               <w:rPr>
                 <w:strike/>
@@ -663,7 +663,7 @@
           </w:p>
         </w:tc>
       </w:tr>
-      <w:tr>
+      <w:tr ns2:paraId="04653B3D" ns2:textId="77777777">
         <w:trPr>
           <w:tblCellSpacing w:w="15" w:type="dxa"/>
         </w:trPr>
@@ -673,7 +673,7 @@
             <w:vAlign w:val="center"/>
             <w:hideMark/>
           </w:tcPr>
-          <w:p>
+          <w:p ns2:paraId="2FF4A469" ns2:textId="77777777">
             <w:pPr>
               <w:rPr>
                 <w:strike/>
@@ -695,7 +695,7 @@
             <w:vAlign w:val="center"/>
             <w:hideMark/>
           </w:tcPr>
-          <w:p>
+          <w:p ns2:paraId="57541766" ns2:textId="77777777">
             <w:pPr>
               <w:rPr>
                 <w:strike/>
@@ -715,7 +715,7 @@
             <w:vAlign w:val="center"/>
             <w:hideMark/>
           </w:tcPr>
-          <w:p>
+          <w:p ns2:paraId="50129A4A" ns2:textId="77777777">
             <w:pPr>
               <w:rPr>
                 <w:strike/>
@@ -737,7 +737,7 @@
             <w:vAlign w:val="center"/>
             <w:hideMark/>
           </w:tcPr>
-          <w:p>
+          <w:p ns2:paraId="74B5FAD9" ns2:textId="77777777">
             <w:pPr>
               <w:rPr>
                 <w:strike/>
@@ -752,7 +752,7 @@
           </w:p>
         </w:tc>
       </w:tr>
-      <w:tr>
+      <w:tr ns2:paraId="60032E0C" ns2:textId="77777777">
         <w:trPr>
           <w:tblCellSpacing w:w="15" w:type="dxa"/>
         </w:trPr>
@@ -762,7 +762,7 @@
             <w:vAlign w:val="center"/>
             <w:hideMark/>
           </w:tcPr>
-          <w:p>
+          <w:p ns2:paraId="3A9E55EC" ns2:textId="77777777">
             <w:pPr>
               <w:rPr>
                 <w:strike/>
@@ -784,7 +784,7 @@
             <w:vAlign w:val="center"/>
             <w:hideMark/>
           </w:tcPr>
-          <w:p>
+          <w:p ns2:paraId="67531281" ns2:textId="77777777">
             <w:pPr>
               <w:rPr>
                 <w:strike/>
@@ -804,7 +804,7 @@
             <w:vAlign w:val="center"/>
             <w:hideMark/>
           </w:tcPr>
-          <w:p>
+          <w:p ns2:paraId="78F9BB8C" ns2:textId="77777777">
             <w:pPr>
               <w:rPr>
                 <w:strike/>
@@ -826,7 +826,7 @@
             <w:vAlign w:val="center"/>
             <w:hideMark/>
           </w:tcPr>
-          <w:p>
+          <w:p ns2:paraId="1F9CDE26" ns2:textId="77777777">
             <w:pPr>
               <w:rPr>
                 <w:strike/>
@@ -841,7 +841,7 @@
           </w:p>
         </w:tc>
       </w:tr>
-      <w:tr>
+      <w:tr ns2:paraId="1705F525" ns2:textId="77777777">
         <w:trPr>
           <w:tblCellSpacing w:w="15" w:type="dxa"/>
         </w:trPr>
@@ -851,7 +851,7 @@
             <w:vAlign w:val="center"/>
             <w:hideMark/>
           </w:tcPr>
-          <w:p>
+          <w:p ns2:paraId="750A5ED1" ns2:textId="77777777">
             <w:pPr>
               <w:rPr>
                 <w:strike/>
@@ -873,7 +873,7 @@
             <w:vAlign w:val="center"/>
             <w:hideMark/>
           </w:tcPr>
-          <w:p>
+          <w:p ns2:paraId="29E47DAD" ns2:textId="77777777">
             <w:pPr>
               <w:rPr>
                 <w:strike/>
@@ -893,7 +893,7 @@
             <w:vAlign w:val="center"/>
             <w:hideMark/>
           </w:tcPr>
-          <w:p>
+          <w:p ns2:paraId="3DB6122A" ns2:textId="77777777">
             <w:pPr>
               <w:rPr>
                 <w:strike/>
@@ -915,7 +915,7 @@
             <w:vAlign w:val="center"/>
             <w:hideMark/>
           </w:tcPr>
-          <w:p>
+          <w:p ns2:paraId="0CE3B791" ns2:textId="77777777">
             <w:pPr>
               <w:rPr>
                 <w:strike/>
@@ -931,7 +931,7 @@
         </w:tc>
       </w:tr>
     </w:tbl>
-    <w:p>
+    <w:p ns2:paraId="5A9A3A25" ns2:textId="77777777">
       <w:pPr>
         <w:rPr>
           <w:b/>
@@ -948,7 +948,7 @@
         <w:t>Datos consolidados tras 1C.2</w:t>
       </w:r>
     </w:p>
-    <w:p>
+    <w:p ns2:paraId="69B59600" ns2:textId="77777777">
       <w:pPr>
         <w:numPr>
           <w:ilvl w:val="0"/>
@@ -965,7 +965,7 @@
         <w:t>9 áreas.</w:t>
       </w:r>
     </w:p>
-    <w:p>
+    <w:p ns2:paraId="764861CD" ns2:textId="77777777">
       <w:pPr>
         <w:numPr>
           <w:ilvl w:val="0"/>
@@ -982,7 +982,7 @@
         <w:t>244 países y territorios.</w:t>
       </w:r>
     </w:p>
-    <w:p>
+    <w:p ns2:paraId="51DCF394" ns2:textId="77777777">
       <w:pPr>
         <w:numPr>
           <w:ilvl w:val="0"/>
@@ -999,7 +999,7 @@
         <w:t>8 indicadores iniciales.</w:t>
       </w:r>
     </w:p>
-    <w:p>
+    <w:p ns2:paraId="24794338" ns2:textId="77777777">
       <w:pPr>
         <w:numPr>
           <w:ilvl w:val="0"/>
@@ -1016,7 +1016,7 @@
         <w:t>72 registros agregados de área.</w:t>
       </w:r>
     </w:p>
-    <w:p>
+    <w:p ns2:paraId="5B1475A3" ns2:textId="77777777">
       <w:pPr>
         <w:numPr>
           <w:ilvl w:val="0"/>
@@ -1047,7 +1047,7 @@
         <w:t>.</w:t>
       </w:r>
     </w:p>
-    <w:p>
+    <w:p ns2:paraId="3AF1D431" ns2:textId="77777777">
       <w:pPr>
         <w:numPr>
           <w:ilvl w:val="0"/>
@@ -1078,7 +1078,7 @@
         <w:t>.</w:t>
       </w:r>
     </w:p>
-    <w:p>
+    <w:p ns2:paraId="6A663DCE" ns2:textId="77777777">
       <w:pPr>
         <w:rPr>
           <w:strike/>
@@ -1088,12 +1088,12 @@
         <w:rPr>
           <w:strike/>
         </w:rPr>
-        <w:pict w14:anchorId="21A733FE">
-          <v:rect id="_x0000_i1026" style="width:0;height:1.5pt" o:hralign="center" o:hrstd="t" o:hr="t" fillcolor="#a0a0a0" stroked="f"/>
+        <w:pict ns2:anchorId="21A733FE">
+          <ns3:rect id="_x0000_i1026" style="width:0;height:1.5pt" ns4:hralign="center" ns4:hrstd="t" ns4:hr="t" fillcolor="#a0a0a0" stroked="f"/>
         </w:pict>
       </w:r>
     </w:p>
-    <w:p>
+    <w:p ns2:paraId="6F5DF827" ns2:textId="77777777">
       <w:pPr>
         <w:rPr>
           <w:b/>
@@ -1128,7 +1128,7 @@
         <w:gridCol w:w="1514"/>
         <w:gridCol w:w="3532"/>
       </w:tblGrid>
-      <w:tr>
+      <w:tr ns2:paraId="1B786ECD" ns2:textId="77777777">
         <w:trPr>
           <w:tblHeader/>
           <w:tblCellSpacing w:w="15" w:type="dxa"/>
@@ -1139,7 +1139,7 @@
             <w:vAlign w:val="center"/>
             <w:hideMark/>
           </w:tcPr>
-          <w:p>
+          <w:p ns2:paraId="0305D4BA" ns2:textId="77777777">
             <w:pPr>
               <w:rPr>
                 <w:b/>
@@ -1164,7 +1164,7 @@
             <w:vAlign w:val="center"/>
             <w:hideMark/>
           </w:tcPr>
-          <w:p>
+          <w:p ns2:paraId="11BE8E0F" ns2:textId="77777777">
             <w:pPr>
               <w:rPr>
                 <w:b/>
@@ -1188,7 +1188,7 @@
             <w:vAlign w:val="center"/>
             <w:hideMark/>
           </w:tcPr>
-          <w:p>
+          <w:p ns2:paraId="565C888D" ns2:textId="77777777">
             <w:pPr>
               <w:rPr>
                 <w:b/>
@@ -1212,7 +1212,7 @@
             <w:vAlign w:val="center"/>
             <w:hideMark/>
           </w:tcPr>
-          <w:p>
+          <w:p ns2:paraId="36EF756C" ns2:textId="77777777">
             <w:pPr>
               <w:rPr>
                 <w:b/>
@@ -1231,7 +1231,7 @@
           </w:p>
         </w:tc>
       </w:tr>
-      <w:tr>
+      <w:tr ns2:paraId="7A25E468" ns2:textId="77777777">
         <w:trPr>
           <w:tblCellSpacing w:w="15" w:type="dxa"/>
         </w:trPr>
@@ -1241,7 +1241,7 @@
             <w:vAlign w:val="center"/>
             <w:hideMark/>
           </w:tcPr>
-          <w:p>
+          <w:p ns2:paraId="763F7BA5" ns2:textId="77777777">
             <w:pPr>
               <w:rPr>
                 <w:strike/>
@@ -1263,7 +1263,7 @@
             <w:vAlign w:val="center"/>
             <w:hideMark/>
           </w:tcPr>
-          <w:p>
+          <w:p ns2:paraId="7C776C96" ns2:textId="77777777">
             <w:pPr>
               <w:rPr>
                 <w:strike/>
@@ -1283,7 +1283,7 @@
             <w:vAlign w:val="center"/>
             <w:hideMark/>
           </w:tcPr>
-          <w:p>
+          <w:p ns2:paraId="0C8DBC3E" ns2:textId="77777777">
             <w:pPr>
               <w:rPr>
                 <w:strike/>
@@ -1305,7 +1305,7 @@
             <w:vAlign w:val="center"/>
             <w:hideMark/>
           </w:tcPr>
-          <w:p>
+          <w:p ns2:paraId="347B52D7" ns2:textId="77777777">
             <w:pPr>
               <w:rPr>
                 <w:strike/>
@@ -1320,7 +1320,7 @@
           </w:p>
         </w:tc>
       </w:tr>
-      <w:tr>
+      <w:tr ns2:paraId="28DA24AD" ns2:textId="77777777">
         <w:trPr>
           <w:tblCellSpacing w:w="15" w:type="dxa"/>
         </w:trPr>
@@ -1330,7 +1330,7 @@
             <w:vAlign w:val="center"/>
             <w:hideMark/>
           </w:tcPr>
-          <w:p>
+          <w:p ns2:paraId="1AB875FA" ns2:textId="77777777">
             <w:pPr>
               <w:rPr>
                 <w:strike/>
@@ -1352,7 +1352,7 @@
             <w:vAlign w:val="center"/>
             <w:hideMark/>
           </w:tcPr>
-          <w:p>
+          <w:p ns2:paraId="3192A59A" ns2:textId="77777777">
             <w:pPr>
               <w:rPr>
                 <w:strike/>
@@ -1372,7 +1372,7 @@
             <w:vAlign w:val="center"/>
             <w:hideMark/>
           </w:tcPr>
-          <w:p>
+          <w:p ns2:paraId="61E7DE1C" ns2:textId="77777777">
             <w:pPr>
               <w:rPr>
                 <w:strike/>
@@ -1394,7 +1394,7 @@
             <w:vAlign w:val="center"/>
             <w:hideMark/>
           </w:tcPr>
-          <w:p>
+          <w:p ns2:paraId="1740B7DC" ns2:textId="77777777">
             <w:pPr>
               <w:rPr>
                 <w:strike/>
@@ -1410,7 +1410,7 @@
         </w:tc>
       </w:tr>
     </w:tbl>
-    <w:p>
+    <w:p ns2:paraId="53BDCBB3" ns2:textId="77777777">
       <w:pPr>
         <w:rPr>
           <w:b/>
@@ -1427,7 +1427,7 @@
         <w:t>Indicadores económicos cargados</w:t>
       </w:r>
     </w:p>
-    <w:p>
+    <w:p ns2:paraId="333C7D7A" ns2:textId="77777777">
       <w:pPr>
         <w:numPr>
           <w:ilvl w:val="0"/>
@@ -1444,7 +1444,7 @@
         <w:t>ECO_PIB</w:t>
       </w:r>
     </w:p>
-    <w:p>
+    <w:p ns2:paraId="32A676EE" ns2:textId="77777777">
       <w:pPr>
         <w:numPr>
           <w:ilvl w:val="0"/>
@@ -1461,7 +1461,7 @@
         <w:t>ECO_PIB_PCT</w:t>
       </w:r>
     </w:p>
-    <w:p>
+    <w:p ns2:paraId="372D587C" ns2:textId="77777777">
       <w:pPr>
         <w:numPr>
           <w:ilvl w:val="0"/>
@@ -1478,7 +1478,7 @@
         <w:t>ECO_PC</w:t>
       </w:r>
     </w:p>
-    <w:p>
+    <w:p ns2:paraId="61A86696" ns2:textId="77777777">
       <w:pPr>
         <w:rPr>
           <w:b/>
@@ -1495,7 +1495,7 @@
         <w:t>Estado MySQL después de 1C.3</w:t>
       </w:r>
     </w:p>
-    <w:p>
+    <w:p ns2:paraId="147464A8" ns2:textId="77777777">
       <w:pPr>
         <w:numPr>
           <w:ilvl w:val="0"/>
@@ -1512,7 +1512,7 @@
         <w:t>3 bloques.</w:t>
       </w:r>
     </w:p>
-    <w:p>
+    <w:p ns2:paraId="5046448A" ns2:textId="77777777">
       <w:pPr>
         <w:numPr>
           <w:ilvl w:val="0"/>
@@ -1529,7 +1529,7 @@
         <w:t>11 indicadores.</w:t>
       </w:r>
     </w:p>
-    <w:p>
+    <w:p ns2:paraId="32C05539" ns2:textId="77777777">
       <w:pPr>
         <w:numPr>
           <w:ilvl w:val="0"/>
@@ -1546,7 +1546,7 @@
         <w:t>99 registros agregados de área.</w:t>
       </w:r>
     </w:p>
-    <w:p>
+    <w:p ns2:paraId="1792458D" ns2:textId="77777777">
       <w:pPr>
         <w:numPr>
           <w:ilvl w:val="0"/>
@@ -1563,7 +1563,7 @@
         <w:t>203 datos nacionales de PIB.</w:t>
       </w:r>
     </w:p>
-    <w:p>
+    <w:p ns2:paraId="6182DD88" ns2:textId="77777777">
       <w:pPr>
         <w:rPr>
           <w:strike/>
@@ -1573,12 +1573,12 @@
         <w:rPr>
           <w:strike/>
         </w:rPr>
-        <w:pict w14:anchorId="2682510C">
-          <v:rect id="_x0000_i1027" style="width:0;height:1.5pt" o:hralign="center" o:hrstd="t" o:hr="t" fillcolor="#a0a0a0" stroked="f"/>
+        <w:pict ns2:anchorId="2682510C">
+          <ns3:rect id="_x0000_i1027" style="width:0;height:1.5pt" ns4:hralign="center" ns4:hrstd="t" ns4:hr="t" fillcolor="#a0a0a0" stroked="f"/>
         </w:pict>
       </w:r>
     </w:p>
-    <w:p>
+    <w:p ns2:paraId="747983CB" ns2:textId="77777777">
       <w:pPr>
         <w:rPr>
           <w:b/>
@@ -1613,7 +1613,7 @@
         <w:gridCol w:w="2952"/>
         <w:gridCol w:w="988"/>
       </w:tblGrid>
-      <w:tr>
+      <w:tr ns2:paraId="0CAC7FEF" ns2:textId="77777777">
         <w:trPr>
           <w:tblHeader/>
           <w:tblCellSpacing w:w="15" w:type="dxa"/>
@@ -1624,7 +1624,7 @@
             <w:vAlign w:val="center"/>
             <w:hideMark/>
           </w:tcPr>
-          <w:p>
+          <w:p ns2:paraId="74C1F755" ns2:textId="77777777">
             <w:pPr>
               <w:rPr>
                 <w:b/>
@@ -1648,7 +1648,7 @@
             <w:vAlign w:val="center"/>
             <w:hideMark/>
           </w:tcPr>
-          <w:p>
+          <w:p ns2:paraId="503A69FE" ns2:textId="77777777">
             <w:pPr>
               <w:rPr>
                 <w:b/>
@@ -1672,7 +1672,7 @@
             <w:vAlign w:val="center"/>
             <w:hideMark/>
           </w:tcPr>
-          <w:p>
+          <w:p ns2:paraId="6C0127B0" ns2:textId="77777777">
             <w:pPr>
               <w:rPr>
                 <w:b/>
@@ -1696,7 +1696,7 @@
             <w:vAlign w:val="center"/>
             <w:hideMark/>
           </w:tcPr>
-          <w:p>
+          <w:p ns2:paraId="035C72CB" ns2:textId="77777777">
             <w:pPr>
               <w:rPr>
                 <w:b/>
@@ -1715,7 +1715,7 @@
           </w:p>
         </w:tc>
       </w:tr>
-      <w:tr>
+      <w:tr ns2:paraId="7A12725F" ns2:textId="77777777">
         <w:trPr>
           <w:tblCellSpacing w:w="15" w:type="dxa"/>
         </w:trPr>
@@ -1725,7 +1725,7 @@
             <w:vAlign w:val="center"/>
             <w:hideMark/>
           </w:tcPr>
-          <w:p>
+          <w:p ns2:paraId="50B4B16A" ns2:textId="77777777">
             <w:pPr>
               <w:rPr>
                 <w:strike/>
@@ -1747,7 +1747,7 @@
             <w:vAlign w:val="center"/>
             <w:hideMark/>
           </w:tcPr>
-          <w:p>
+          <w:p ns2:paraId="3F071530" ns2:textId="77777777">
             <w:pPr>
               <w:rPr>
                 <w:strike/>
@@ -1767,7 +1767,7 @@
             <w:vAlign w:val="center"/>
             <w:hideMark/>
           </w:tcPr>
-          <w:p>
+          <w:p ns2:paraId="0DC49893" ns2:textId="34B1F078">
             <w:pPr>
               <w:rPr>
                 <w:strike/>
@@ -1789,7 +1789,7 @@
             <w:vAlign w:val="center"/>
             <w:hideMark/>
           </w:tcPr>
-          <w:p>
+          <w:p ns2:paraId="4A1DF37A" ns2:textId="139A3EAC">
             <w:pPr>
               <w:rPr>
                 <w:strike/>
@@ -1799,7 +1799,7 @@
         </w:tc>
       </w:tr>
     </w:tbl>
-    <w:p>
+    <w:p ns2:paraId="172B1880" ns2:textId="2DE220CF">
       <w:pPr>
         <w:rPr>
           <w:strike/>
@@ -1809,12 +1809,12 @@
         <w:rPr>
           <w:strike/>
         </w:rPr>
-        <w:pict w14:anchorId="706BEE8E">
-          <v:rect id="_x0000_i1028" style="width:0;height:1.5pt" o:hralign="center" o:hrstd="t" o:hr="t" fillcolor="#a0a0a0" stroked="f"/>
+        <w:pict ns2:anchorId="706BEE8E">
+          <ns3:rect id="_x0000_i1028" style="width:0;height:1.5pt" ns4:hralign="center" ns4:hrstd="t" ns4:hr="t" fillcolor="#a0a0a0" stroked="f"/>
         </w:pict>
       </w:r>
     </w:p>
-    <w:p>
+    <w:p ns2:paraId="6B579B06" ns2:textId="77777777">
       <w:pPr>
         <w:rPr>
           <w:b/>
@@ -1826,12 +1826,12 @@
           <w:b/>
           <w:bCs/>
         </w:rPr>
-        <w:t>5. Fases de datos que quedan</w:t>
+        <w:t>5. Estado consolidado de datos y conexión</w:t>
       </w:r>
     </w:p>
-    <w:p>
+    <w:p ns2:paraId="1AE31BAF" ns2:textId="77777777">
       <w:r>
-        <w:t>La numeración detallada posterior todavía debe terminar de fijarse, pero los bloques pendientes son estos:</w:t>
+        <w:t>La primera edición de datos está finalizada y la conexión inicial con MySQL ha sido validada.</w:t>
       </w:r>
     </w:p>
     <w:tbl>
@@ -1851,7 +1851,7 @@
         <w:gridCol w:w="5233"/>
         <w:gridCol w:w="1862"/>
       </w:tblGrid>
-      <w:tr>
+      <w:tr ns2:paraId="2A0CC224" ns2:textId="77777777">
         <w:trPr>
           <w:tblHeader/>
           <w:tblCellSpacing w:w="15" w:type="dxa"/>
@@ -1862,29 +1862,29 @@
             <w:vAlign w:val="center"/>
             <w:hideMark/>
           </w:tcPr>
-          <w:p>
-            <w:pPr>
-              <w:rPr>
-                <w:b/>
-                <w:bCs/>
-              </w:rPr>
-            </w:pPr>
-            <w:r>
-              <w:rPr>
-                <w:b/>
-                <w:bCs/>
-              </w:rPr>
-              <w:t>Fase prevista</w:t>
-            </w:r>
-          </w:p>
-        </w:tc>
-        <w:tc>
-          <w:tcPr>
-            <w:tcW w:w="0" w:type="auto"/>
-            <w:vAlign w:val="center"/>
-            <w:hideMark/>
-          </w:tcPr>
-          <w:p>
+          <w:p ns2:paraId="15A9CEA3" ns2:textId="77777777">
+            <w:pPr>
+              <w:rPr>
+                <w:b/>
+                <w:bCs/>
+              </w:rPr>
+            </w:pPr>
+            <w:r>
+              <w:rPr>
+                <w:b/>
+                <w:bCs/>
+              </w:rPr>
+              <w:t>Fase</w:t>
+            </w:r>
+          </w:p>
+        </w:tc>
+        <w:tc>
+          <w:tcPr>
+            <w:tcW w:w="0" w:type="auto"/>
+            <w:vAlign w:val="center"/>
+            <w:hideMark/>
+          </w:tcPr>
+          <w:p ns2:paraId="2E68F053" ns2:textId="77777777">
             <w:pPr>
               <w:rPr>
                 <w:b/>
@@ -1906,7 +1906,7 @@
             <w:vAlign w:val="center"/>
             <w:hideMark/>
           </w:tcPr>
-          <w:p>
+          <w:p ns2:paraId="0AD860F8" ns2:textId="77777777">
             <w:pPr>
               <w:rPr>
                 <w:b/>
@@ -1923,7 +1923,7 @@
           </w:p>
         </w:tc>
       </w:tr>
-      <w:tr>
+      <w:tr ns2:paraId="54942267" ns2:textId="77777777">
         <w:trPr>
           <w:tblCellSpacing w:w="15" w:type="dxa"/>
         </w:trPr>
@@ -1933,64 +1933,64 @@
             <w:vAlign w:val="center"/>
             <w:hideMark/>
           </w:tcPr>
-          <w:p>
-            <w:pPr>
-              <w:rPr>
-                <w:strike/>
-              </w:rPr>
-            </w:pPr>
-            <w:r>
-              <w:rPr>
-                <w:b/>
-                <w:bCs/>
-                <w:strike/>
-              </w:rPr>
-              <w:t>1C.5</w:t>
-            </w:r>
-          </w:p>
-        </w:tc>
-        <w:tc>
-          <w:tcPr>
-            <w:tcW w:w="0" w:type="auto"/>
-            <w:vAlign w:val="center"/>
-            <w:hideMark/>
-          </w:tcPr>
-          <w:p>
-            <w:pPr>
-              <w:rPr>
-                <w:strike/>
-              </w:rPr>
-            </w:pPr>
-            <w:r>
-              <w:rPr>
-                <w:strike/>
-              </w:rPr>
-              <w:t>Fuerza militar y seguridad</w:t>
-            </w:r>
-          </w:p>
-        </w:tc>
-        <w:tc>
-          <w:tcPr>
-            <w:tcW w:w="0" w:type="auto"/>
-            <w:vAlign w:val="center"/>
-            <w:hideMark/>
-          </w:tcPr>
-          <w:p>
-            <w:pPr>
-              <w:rPr>
-                <w:strike/>
-              </w:rPr>
-            </w:pPr>
-            <w:r>
-              <w:rPr>
-                <w:strike/>
-              </w:rPr>
-              <w:t>Pendiente</w:t>
+          <w:p ns2:paraId="4680B3D2" ns2:textId="77777777">
+            <w:pPr>
+              <w:rPr>
+                <w:strike/>
+              </w:rPr>
+            </w:pPr>
+            <w:r>
+              <w:rPr>
+                <w:b/>
+                <w:bCs/>
+                <w:strike/>
+              </w:rPr>
+              <w:t>1C</w:t>
+            </w:r>
+          </w:p>
+        </w:tc>
+        <w:tc>
+          <w:tcPr>
+            <w:tcW w:w="0" w:type="auto"/>
+            <w:vAlign w:val="center"/>
+            <w:hideMark/>
+          </w:tcPr>
+          <w:p ns2:paraId="527F69D6" ns2:textId="77777777">
+            <w:pPr>
+              <w:rPr>
+                <w:strike/>
+              </w:rPr>
+            </w:pPr>
+            <w:r>
+              <w:rPr>
+                <w:strike/>
+              </w:rPr>
+              <w:t>RG2025_V1 congelada y activa en MySQL: 9 áreas, 244 países y territorios, 8 bloques, 27 indicadores y 243 registros activos de área. Sin duplicidades ni datos activos sin fuente.</w:t>
+            </w:r>
+          </w:p>
+        </w:tc>
+        <w:tc>
+          <w:tcPr>
+            <w:tcW w:w="0" w:type="auto"/>
+            <w:vAlign w:val="center"/>
+            <w:hideMark/>
+          </w:tcPr>
+          <w:p ns2:paraId="7D0C1BD1" ns2:textId="77777777">
+            <w:pPr>
+              <w:rPr>
+                <w:strike/>
+              </w:rPr>
+            </w:pPr>
+            <w:r>
+              <w:rPr>
+                <w:strike/>
+              </w:rPr>
+              <w:t>Finalizada — 1C.9 cerrada con GO</w:t>
             </w:r>
           </w:p>
         </w:tc>
       </w:tr>
-      <w:tr>
+      <w:tr ns2:paraId="54942267" ns2:textId="77777777">
         <w:trPr>
           <w:tblCellSpacing w:w="15" w:type="dxa"/>
         </w:trPr>
@@ -2000,42 +2000,64 @@
             <w:vAlign w:val="center"/>
             <w:hideMark/>
           </w:tcPr>
-          <w:p>
-            <w:r>
-              <w:rPr>
-                <w:b/>
-                <w:bCs/>
-              </w:rPr>
-              <w:t>1C.6</w:t>
-            </w:r>
-          </w:p>
-        </w:tc>
-        <w:tc>
-          <w:tcPr>
-            <w:tcW w:w="0" w:type="auto"/>
-            <w:vAlign w:val="center"/>
-            <w:hideMark/>
-          </w:tcPr>
-          <w:p>
-            <w:r>
-              <w:t>Energía, autonomía energética y recursos</w:t>
-            </w:r>
-          </w:p>
-        </w:tc>
-        <w:tc>
-          <w:tcPr>
-            <w:tcW w:w="0" w:type="auto"/>
-            <w:vAlign w:val="center"/>
-            <w:hideMark/>
-          </w:tcPr>
-          <w:p>
-            <w:r>
-              <w:t>Parada por GitHUB</w:t>
+          <w:p ns2:paraId="4680B3D2" ns2:textId="77777777">
+            <w:pPr>
+              <w:rPr>
+                <w:strike/>
+              </w:rPr>
+            </w:pPr>
+            <w:r>
+              <w:rPr>
+                <w:b/>
+                <w:bCs/>
+                <w:strike/>
+              </w:rPr>
+              <w:t>1D.1</w:t>
+            </w:r>
+          </w:p>
+        </w:tc>
+        <w:tc>
+          <w:tcPr>
+            <w:tcW w:w="0" w:type="auto"/>
+            <w:vAlign w:val="center"/>
+            <w:hideMark/>
+          </w:tcPr>
+          <w:p ns2:paraId="527F69D6" ns2:textId="77777777">
+            <w:pPr>
+              <w:rPr>
+                <w:strike/>
+              </w:rPr>
+            </w:pPr>
+            <w:r>
+              <w:rPr>
+                <w:strike/>
+              </w:rPr>
+              <w:t>Diagnóstico técnico y contrato de datos.</w:t>
+            </w:r>
+          </w:p>
+        </w:tc>
+        <w:tc>
+          <w:tcPr>
+            <w:tcW w:w="0" w:type="auto"/>
+            <w:vAlign w:val="center"/>
+            <w:hideMark/>
+          </w:tcPr>
+          <w:p ns2:paraId="7D0C1BD1" ns2:textId="77777777">
+            <w:pPr>
+              <w:rPr>
+                <w:strike/>
+              </w:rPr>
+            </w:pPr>
+            <w:r>
+              <w:rPr>
+                <w:strike/>
+              </w:rPr>
+              <w:t>Finalizada — GO</w:t>
             </w:r>
           </w:p>
         </w:tc>
       </w:tr>
-      <w:tr>
+      <w:tr ns2:paraId="54942267" ns2:textId="77777777">
         <w:trPr>
           <w:tblCellSpacing w:w="15" w:type="dxa"/>
         </w:trPr>
@@ -2045,42 +2067,64 @@
             <w:vAlign w:val="center"/>
             <w:hideMark/>
           </w:tcPr>
-          <w:p>
-            <w:r>
-              <w:rPr>
-                <w:b/>
-                <w:bCs/>
-              </w:rPr>
-              <w:t>1C.7</w:t>
-            </w:r>
-          </w:p>
-        </w:tc>
-        <w:tc>
-          <w:tcPr>
-            <w:tcW w:w="0" w:type="auto"/>
-            <w:vAlign w:val="center"/>
-            <w:hideMark/>
-          </w:tcPr>
-          <w:p>
-            <w:r>
-              <w:t>Tecnología, inteligencia artificial y capacidad industrial</w:t>
-            </w:r>
-          </w:p>
-        </w:tc>
-        <w:tc>
-          <w:tcPr>
-            <w:tcW w:w="0" w:type="auto"/>
-            <w:vAlign w:val="center"/>
-            <w:hideMark/>
-          </w:tcPr>
-          <w:p>
-            <w:r>
-              <w:t>Pendiente</w:t>
+          <w:p ns2:paraId="4680B3D2" ns2:textId="77777777">
+            <w:pPr>
+              <w:rPr>
+                <w:strike/>
+              </w:rPr>
+            </w:pPr>
+            <w:r>
+              <w:rPr>
+                <w:b/>
+                <w:bCs/>
+                <w:strike/>
+              </w:rPr>
+              <w:t>1D.2</w:t>
+            </w:r>
+          </w:p>
+        </w:tc>
+        <w:tc>
+          <w:tcPr>
+            <w:tcW w:w="0" w:type="auto"/>
+            <w:vAlign w:val="center"/>
+            <w:hideMark/>
+          </w:tcPr>
+          <w:p ns2:paraId="527F69D6" ns2:textId="77777777">
+            <w:pPr>
+              <w:rPr>
+                <w:strike/>
+              </w:rPr>
+            </w:pPr>
+            <w:r>
+              <w:rPr>
+                <w:strike/>
+              </w:rPr>
+              <w:t>API MySQL mínima implementada y comprobada en un entorno temporal de prueba. GET /api/reticula/v1/status.php devuelve RG2025_V1, estado congelado y totales 9/244/8/27/243. Configuración protegida y fuera de Git; código limitado a consultas SELECT.</w:t>
+            </w:r>
+          </w:p>
+        </w:tc>
+        <w:tc>
+          <w:tcPr>
+            <w:tcW w:w="0" w:type="auto"/>
+            <w:vAlign w:val="center"/>
+            <w:hideMark/>
+          </w:tcPr>
+          <w:p ns2:paraId="7D0C1BD1" ns2:textId="77777777">
+            <w:pPr>
+              <w:rPr>
+                <w:strike/>
+              </w:rPr>
+            </w:pPr>
+            <w:r>
+              <w:rPr>
+                <w:strike/>
+              </w:rPr>
+              <w:t>GO operativo condicionado</w:t>
             </w:r>
           </w:p>
         </w:tc>
       </w:tr>
-      <w:tr>
+      <w:tr ns2:paraId="54942267" ns2:textId="77777777">
         <w:trPr>
           <w:tblCellSpacing w:w="15" w:type="dxa"/>
         </w:trPr>
@@ -2090,102 +2134,70 @@
             <w:vAlign w:val="center"/>
             <w:hideMark/>
           </w:tcPr>
-          <w:p>
-            <w:r>
-              <w:rPr>
-                <w:b/>
-                <w:bCs/>
-              </w:rPr>
-              <w:t>1C.8</w:t>
-            </w:r>
-          </w:p>
-        </w:tc>
-        <w:tc>
-          <w:tcPr>
-            <w:tcW w:w="0" w:type="auto"/>
-            <w:vAlign w:val="center"/>
-            <w:hideMark/>
-          </w:tcPr>
-          <w:p>
-            <w:r>
-              <w:t>Revisión conjunta de indicadores y coberturas</w:t>
-            </w:r>
-          </w:p>
-        </w:tc>
-        <w:tc>
-          <w:tcPr>
-            <w:tcW w:w="0" w:type="auto"/>
-            <w:vAlign w:val="center"/>
-            <w:hideMark/>
-          </w:tcPr>
-          <w:p>
-            <w:r>
-              <w:t>Pendiente</w:t>
-            </w:r>
-          </w:p>
-        </w:tc>
-      </w:tr>
-      <w:tr>
-        <w:trPr>
-          <w:tblCellSpacing w:w="15" w:type="dxa"/>
-        </w:trPr>
-        <w:tc>
-          <w:tcPr>
-            <w:tcW w:w="0" w:type="auto"/>
-            <w:vAlign w:val="center"/>
-            <w:hideMark/>
-          </w:tcPr>
-          <w:p>
-            <w:r>
-              <w:rPr>
-                <w:b/>
-                <w:bCs/>
-              </w:rPr>
-              <w:t>1C.9</w:t>
-            </w:r>
-          </w:p>
-        </w:tc>
-        <w:tc>
-          <w:tcPr>
-            <w:tcW w:w="0" w:type="auto"/>
-            <w:vAlign w:val="center"/>
-            <w:hideMark/>
-          </w:tcPr>
-          <w:p>
-            <w:r>
-              <w:t>Congelación de la primera edición de datos</w:t>
-            </w:r>
-          </w:p>
-        </w:tc>
-        <w:tc>
-          <w:tcPr>
-            <w:tcW w:w="0" w:type="auto"/>
-            <w:vAlign w:val="center"/>
-            <w:hideMark/>
-          </w:tcPr>
-          <w:p>
-            <w:r>
-              <w:t>Pendiente</w:t>
+          <w:p ns2:paraId="4680B3D2" ns2:textId="77777777">
+            <w:pPr>
+              <w:rPr>
+                <w:strike/>
+              </w:rPr>
+            </w:pPr>
+            <w:r>
+              <w:rPr>
+                <w:b/>
+                <w:bCs/>
+                <w:strike/>
+              </w:rPr>
+              <w:t>Pendiente de producción</w:t>
+            </w:r>
+          </w:p>
+        </w:tc>
+        <w:tc>
+          <w:tcPr>
+            <w:tcW w:w="0" w:type="auto"/>
+            <w:vAlign w:val="center"/>
+            <w:hideMark/>
+          </w:tcPr>
+          <w:p ns2:paraId="527F69D6" ns2:textId="77777777">
+            <w:pPr>
+              <w:rPr>
+                <w:strike/>
+              </w:rPr>
+            </w:pPr>
+            <w:r>
+              <w:rPr>
+                <w:strike/>
+              </w:rPr>
+              <w:t>Disponer de un usuario MySQL con permisos exclusivamente de lectura.</w:t>
+            </w:r>
+          </w:p>
+        </w:tc>
+        <w:tc>
+          <w:tcPr>
+            <w:tcW w:w="0" w:type="auto"/>
+            <w:vAlign w:val="center"/>
+            <w:hideMark/>
+          </w:tcPr>
+          <w:p ns2:paraId="7D0C1BD1" ns2:textId="77777777">
+            <w:pPr>
+              <w:rPr>
+                <w:strike/>
+              </w:rPr>
+            </w:pPr>
+            <w:r>
+              <w:rPr>
+                <w:strike/>
+              </w:rPr>
+              <w:t>No bloquea el desarrollo ni la presentación de la web</w:t>
             </w:r>
           </w:p>
         </w:tc>
       </w:tr>
     </w:tbl>
-    <w:p/>
-    <w:p>
+    <w:p ns2:paraId="1AE31BAF" ns2:textId="77777777">
       <w:r>
-        <w:br w:type="page"/>
+        <w:t/>
       </w:r>
     </w:p>
-    <w:p>
-      <w:r>
-        <w:lastRenderedPageBreak/>
-        <w:pict w14:anchorId="77ABBC70">
-          <v:rect id="_x0000_i1029" style="width:0;height:1.5pt" o:hralign="center" o:hrstd="t" o:hr="t" fillcolor="#a0a0a0" stroked="f"/>
-        </w:pict>
-      </w:r>
-    </w:p>
-    <w:p>
+    <w:p ns2:paraId="2580410B" ns2:textId="77777777">
       <w:pPr>
         <w:rPr>
           <w:b/>
@@ -2197,7 +2209,7 @@
           <w:b/>
           <w:bCs/>
         </w:rPr>
-        <w:t>6. Trabajo de aplicación y visualización pendiente</w:t>
+        <w:t>6. Trabajo de aplicación y visualización</w:t>
       </w:r>
     </w:p>
     <w:tbl>
@@ -2217,7 +2229,7 @@
         <w:gridCol w:w="5495"/>
         <w:gridCol w:w="1030"/>
       </w:tblGrid>
-      <w:tr>
+      <w:tr ns2:paraId="0468BD63" ns2:textId="77777777">
         <w:trPr>
           <w:tblHeader/>
           <w:tblCellSpacing w:w="15" w:type="dxa"/>
@@ -2228,7 +2240,7 @@
             <w:vAlign w:val="center"/>
             <w:hideMark/>
           </w:tcPr>
-          <w:p>
+          <w:p ns2:paraId="444C1784" ns2:textId="77777777">
             <w:pPr>
               <w:rPr>
                 <w:b/>
@@ -2250,7 +2262,7 @@
             <w:vAlign w:val="center"/>
             <w:hideMark/>
           </w:tcPr>
-          <w:p>
+          <w:p ns2:paraId="362EF899" ns2:textId="77777777">
             <w:pPr>
               <w:rPr>
                 <w:b/>
@@ -2272,7 +2284,7 @@
             <w:vAlign w:val="center"/>
             <w:hideMark/>
           </w:tcPr>
-          <w:p>
+          <w:p ns2:paraId="4303D0A9" ns2:textId="77777777">
             <w:pPr>
               <w:rPr>
                 <w:b/>
@@ -2289,7 +2301,7 @@
           </w:p>
         </w:tc>
       </w:tr>
-      <w:tr>
+      <w:tr ns2:paraId="50BB9F6B" ns2:textId="77777777">
         <w:trPr>
           <w:tblCellSpacing w:w="15" w:type="dxa"/>
         </w:trPr>
@@ -2299,42 +2311,42 @@
             <w:vAlign w:val="center"/>
             <w:hideMark/>
           </w:tcPr>
-          <w:p>
-            <w:r>
-              <w:rPr>
-                <w:b/>
-                <w:bCs/>
-              </w:rPr>
-              <w:t>Diseño del mapa</w:t>
-            </w:r>
-          </w:p>
-        </w:tc>
-        <w:tc>
-          <w:tcPr>
-            <w:tcW w:w="0" w:type="auto"/>
-            <w:vAlign w:val="center"/>
-            <w:hideMark/>
-          </w:tcPr>
-          <w:p>
-            <w:r>
-              <w:t>Colores, tramas, leyenda y representación de las nueve áreas</w:t>
-            </w:r>
-          </w:p>
-        </w:tc>
-        <w:tc>
-          <w:tcPr>
-            <w:tcW w:w="0" w:type="auto"/>
-            <w:vAlign w:val="center"/>
-            <w:hideMark/>
-          </w:tcPr>
-          <w:p>
-            <w:r>
-              <w:t>Pendiente</w:t>
+          <w:p ns2:paraId="41363836" ns2:textId="77777777">
+            <w:r>
+              <w:rPr>
+                <w:b/>
+                <w:bCs/>
+              </w:rPr>
+              <w:t>Conexión web–MySQL</w:t>
+            </w:r>
+          </w:p>
+        </w:tc>
+        <w:tc>
+          <w:tcPr>
+            <w:tcW w:w="0" w:type="auto"/>
+            <w:vAlign w:val="center"/>
+            <w:hideMark/>
+          </w:tcPr>
+          <w:p ns2:paraId="581740C3" ns2:textId="77777777">
+            <w:r>
+              <w:t>Conexión de la aplicación web con MySQL.</w:t>
+            </w:r>
+          </w:p>
+        </w:tc>
+        <w:tc>
+          <w:tcPr>
+            <w:tcW w:w="0" w:type="auto"/>
+            <w:vAlign w:val="center"/>
+            <w:hideMark/>
+          </w:tcPr>
+          <w:p ns2:paraId="0F1C6E2E" ns2:textId="77777777">
+            <w:r>
+              <w:t>En curso</w:t>
             </w:r>
           </w:p>
         </w:tc>
       </w:tr>
-      <w:tr>
+      <w:tr ns2:paraId="50BB9F6B" ns2:textId="77777777">
         <w:trPr>
           <w:tblCellSpacing w:w="15" w:type="dxa"/>
         </w:trPr>
@@ -2344,42 +2356,42 @@
             <w:vAlign w:val="center"/>
             <w:hideMark/>
           </w:tcPr>
-          <w:p>
-            <w:r>
-              <w:rPr>
-                <w:b/>
-                <w:bCs/>
-              </w:rPr>
-              <w:t>Portada</w:t>
-            </w:r>
-          </w:p>
-        </w:tc>
-        <w:tc>
-          <w:tcPr>
-            <w:tcW w:w="0" w:type="auto"/>
-            <w:vAlign w:val="center"/>
-            <w:hideMark/>
-          </w:tcPr>
-          <w:p>
-            <w:r>
-              <w:t>Resumen global y comparación de áreas</w:t>
-            </w:r>
-          </w:p>
-        </w:tc>
-        <w:tc>
-          <w:tcPr>
-            <w:tcW w:w="0" w:type="auto"/>
-            <w:vAlign w:val="center"/>
-            <w:hideMark/>
-          </w:tcPr>
-          <w:p>
-            <w:r>
-              <w:t>Pendiente</w:t>
+          <w:p ns2:paraId="41363836" ns2:textId="77777777">
+            <w:r>
+              <w:rPr>
+                <w:b/>
+                <w:bCs/>
+              </w:rPr>
+              <w:t>Primera entrega visible</w:t>
+            </w:r>
+          </w:p>
+        </w:tc>
+        <w:tc>
+          <w:tcPr>
+            <w:tcW w:w="0" w:type="auto"/>
+            <w:vAlign w:val="center"/>
+            <w:hideMark/>
+          </w:tcPr>
+          <w:p ns2:paraId="581740C3" ns2:textId="77777777">
+            <w:r>
+              <w:t>Tabla de Datos Consolidados con los datos reales de RG2025_V1 obtenidos a través de la API.</w:t>
+            </w:r>
+          </w:p>
+        </w:tc>
+        <w:tc>
+          <w:tcPr>
+            <w:tcW w:w="0" w:type="auto"/>
+            <w:vAlign w:val="center"/>
+            <w:hideMark/>
+          </w:tcPr>
+          <w:p ns2:paraId="0F1C6E2E" ns2:textId="77777777">
+            <w:r>
+              <w:t>Siguiente tarea</w:t>
             </w:r>
           </w:p>
         </w:tc>
       </w:tr>
-      <w:tr>
+      <w:tr ns2:paraId="50BB9F6B" ns2:textId="77777777">
         <w:trPr>
           <w:tblCellSpacing w:w="15" w:type="dxa"/>
         </w:trPr>
@@ -2389,42 +2401,42 @@
             <w:vAlign w:val="center"/>
             <w:hideMark/>
           </w:tcPr>
-          <w:p>
-            <w:r>
-              <w:rPr>
-                <w:b/>
-                <w:bCs/>
-              </w:rPr>
-              <w:t>Gráficas</w:t>
-            </w:r>
-          </w:p>
-        </w:tc>
-        <w:tc>
-          <w:tcPr>
-            <w:tcW w:w="0" w:type="auto"/>
-            <w:vAlign w:val="center"/>
-            <w:hideMark/>
-          </w:tcPr>
-          <w:p>
-            <w:r>
-              <w:t>Población, territorio, economía, desarrollo humano y demás bloques</w:t>
-            </w:r>
-          </w:p>
-        </w:tc>
-        <w:tc>
-          <w:tcPr>
-            <w:tcW w:w="0" w:type="auto"/>
-            <w:vAlign w:val="center"/>
-            <w:hideMark/>
-          </w:tcPr>
-          <w:p>
-            <w:r>
-              <w:t>Pendiente</w:t>
+          <w:p ns2:paraId="41363836" ns2:textId="77777777">
+            <w:r>
+              <w:rPr>
+                <w:b/>
+                <w:bCs/>
+              </w:rPr>
+              <w:t>Portada y resumen</w:t>
+            </w:r>
+          </w:p>
+        </w:tc>
+        <w:tc>
+          <w:tcPr>
+            <w:tcW w:w="0" w:type="auto"/>
+            <w:vAlign w:val="center"/>
+            <w:hideMark/>
+          </w:tcPr>
+          <w:p ns2:paraId="581740C3" ns2:textId="77777777">
+            <w:r>
+              <w:t>Resumen global y comparación de áreas.</w:t>
+            </w:r>
+          </w:p>
+        </w:tc>
+        <w:tc>
+          <w:tcPr>
+            <w:tcW w:w="0" w:type="auto"/>
+            <w:vAlign w:val="center"/>
+            <w:hideMark/>
+          </w:tcPr>
+          <w:p ns2:paraId="0F1C6E2E" ns2:textId="77777777">
+            <w:r>
+              <w:t>Después de la tabla</w:t>
             </w:r>
           </w:p>
         </w:tc>
       </w:tr>
-      <w:tr>
+      <w:tr ns2:paraId="50BB9F6B" ns2:textId="77777777">
         <w:trPr>
           <w:tblCellSpacing w:w="15" w:type="dxa"/>
         </w:trPr>
@@ -2434,42 +2446,42 @@
             <w:vAlign w:val="center"/>
             <w:hideMark/>
           </w:tcPr>
-          <w:p>
-            <w:r>
-              <w:rPr>
-                <w:b/>
-                <w:bCs/>
-              </w:rPr>
-              <w:t>Fichas de área</w:t>
-            </w:r>
-          </w:p>
-        </w:tc>
-        <w:tc>
-          <w:tcPr>
-            <w:tcW w:w="0" w:type="auto"/>
-            <w:vAlign w:val="center"/>
-            <w:hideMark/>
-          </w:tcPr>
-          <w:p>
-            <w:r>
-              <w:t>Perfil completo de cada área</w:t>
-            </w:r>
-          </w:p>
-        </w:tc>
-        <w:tc>
-          <w:tcPr>
-            <w:tcW w:w="0" w:type="auto"/>
-            <w:vAlign w:val="center"/>
-            <w:hideMark/>
-          </w:tcPr>
-          <w:p>
-            <w:r>
-              <w:t>Pendiente</w:t>
+          <w:p ns2:paraId="41363836" ns2:textId="77777777">
+            <w:r>
+              <w:rPr>
+                <w:b/>
+                <w:bCs/>
+              </w:rPr>
+              <w:t>Fichas y gráficas</w:t>
+            </w:r>
+          </w:p>
+        </w:tc>
+        <w:tc>
+          <w:tcPr>
+            <w:tcW w:w="0" w:type="auto"/>
+            <w:vAlign w:val="center"/>
+            <w:hideMark/>
+          </w:tcPr>
+          <w:p ns2:paraId="581740C3" ns2:textId="77777777">
+            <w:r>
+              <w:t>Fichas de áreas y representaciones de los bloques de datos.</w:t>
+            </w:r>
+          </w:p>
+        </w:tc>
+        <w:tc>
+          <w:tcPr>
+            <w:tcW w:w="0" w:type="auto"/>
+            <w:vAlign w:val="center"/>
+            <w:hideMark/>
+          </w:tcPr>
+          <w:p ns2:paraId="0F1C6E2E" ns2:textId="77777777">
+            <w:r>
+              <w:t>Después de portada/resumen</w:t>
             </w:r>
           </w:p>
         </w:tc>
       </w:tr>
-      <w:tr>
+      <w:tr ns2:paraId="50BB9F6B" ns2:textId="77777777">
         <w:trPr>
           <w:tblCellSpacing w:w="15" w:type="dxa"/>
         </w:trPr>
@@ -2479,42 +2491,42 @@
             <w:vAlign w:val="center"/>
             <w:hideMark/>
           </w:tcPr>
-          <w:p>
-            <w:r>
-              <w:rPr>
-                <w:b/>
-                <w:bCs/>
-              </w:rPr>
-              <w:t>Interacción</w:t>
-            </w:r>
-          </w:p>
-        </w:tc>
-        <w:tc>
-          <w:tcPr>
-            <w:tcW w:w="0" w:type="auto"/>
-            <w:vAlign w:val="center"/>
-            <w:hideMark/>
-          </w:tcPr>
-          <w:p>
-            <w:r>
-              <w:t>Filtros, selección de indicadores y navegación</w:t>
-            </w:r>
-          </w:p>
-        </w:tc>
-        <w:tc>
-          <w:tcPr>
-            <w:tcW w:w="0" w:type="auto"/>
-            <w:vAlign w:val="center"/>
-            <w:hideMark/>
-          </w:tcPr>
-          <w:p>
-            <w:r>
-              <w:t>Pendiente</w:t>
+          <w:p ns2:paraId="41363836" ns2:textId="77777777">
+            <w:r>
+              <w:rPr>
+                <w:b/>
+                <w:bCs/>
+              </w:rPr>
+              <w:t>Metodología y mapa</w:t>
+            </w:r>
+          </w:p>
+        </w:tc>
+        <w:tc>
+          <w:tcPr>
+            <w:tcW w:w="0" w:type="auto"/>
+            <w:vAlign w:val="center"/>
+            <w:hideMark/>
+          </w:tcPr>
+          <w:p ns2:paraId="581740C3" ns2:textId="77777777">
+            <w:r>
+              <w:t>Metodología, mapa e interacción.</w:t>
+            </w:r>
+          </w:p>
+        </w:tc>
+        <w:tc>
+          <w:tcPr>
+            <w:tcW w:w="0" w:type="auto"/>
+            <w:vAlign w:val="center"/>
+            <w:hideMark/>
+          </w:tcPr>
+          <w:p ns2:paraId="0F1C6E2E" ns2:textId="77777777">
+            <w:r>
+              <w:t>Desarrollo posterior</w:t>
             </w:r>
           </w:p>
         </w:tc>
       </w:tr>
-      <w:tr>
+      <w:tr ns2:paraId="50BB9F6B" ns2:textId="77777777">
         <w:trPr>
           <w:tblCellSpacing w:w="15" w:type="dxa"/>
         </w:trPr>
@@ -2524,145 +2536,188 @@
             <w:vAlign w:val="center"/>
             <w:hideMark/>
           </w:tcPr>
-          <w:p>
-            <w:r>
-              <w:rPr>
-                <w:b/>
-                <w:bCs/>
-              </w:rPr>
-              <w:t>Conexión web–MySQL</w:t>
-            </w:r>
-          </w:p>
-        </w:tc>
-        <w:tc>
-          <w:tcPr>
-            <w:tcW w:w="0" w:type="auto"/>
-            <w:vAlign w:val="center"/>
-            <w:hideMark/>
-          </w:tcPr>
-          <w:p>
-            <w:r>
-              <w:t>API o lectura desde la aplicación</w:t>
-            </w:r>
-          </w:p>
-        </w:tc>
-        <w:tc>
-          <w:tcPr>
-            <w:tcW w:w="0" w:type="auto"/>
-            <w:vAlign w:val="center"/>
-            <w:hideMark/>
-          </w:tcPr>
-          <w:p>
-            <w:r>
-              <w:t>Pendiente</w:t>
-            </w:r>
-          </w:p>
-        </w:tc>
-      </w:tr>
-      <w:tr>
-        <w:trPr>
-          <w:tblCellSpacing w:w="15" w:type="dxa"/>
-        </w:trPr>
-        <w:tc>
-          <w:tcPr>
-            <w:tcW w:w="0" w:type="auto"/>
-            <w:vAlign w:val="center"/>
-            <w:hideMark/>
-          </w:tcPr>
-          <w:p>
-            <w:r>
-              <w:rPr>
-                <w:b/>
-                <w:bCs/>
-              </w:rPr>
-              <w:t>Pruebas</w:t>
-            </w:r>
-          </w:p>
-        </w:tc>
-        <w:tc>
-          <w:tcPr>
-            <w:tcW w:w="0" w:type="auto"/>
-            <w:vAlign w:val="center"/>
-            <w:hideMark/>
-          </w:tcPr>
-          <w:p>
-            <w:r>
-              <w:t>Escritorio, móvil, coherencia y rendimiento</w:t>
-            </w:r>
-          </w:p>
-        </w:tc>
-        <w:tc>
-          <w:tcPr>
-            <w:tcW w:w="0" w:type="auto"/>
-            <w:vAlign w:val="center"/>
-            <w:hideMark/>
-          </w:tcPr>
-          <w:p>
-            <w:r>
-              <w:t>Pendiente</w:t>
-            </w:r>
-          </w:p>
-        </w:tc>
-      </w:tr>
-      <w:tr>
-        <w:trPr>
-          <w:tblCellSpacing w:w="15" w:type="dxa"/>
-        </w:trPr>
-        <w:tc>
-          <w:tcPr>
-            <w:tcW w:w="0" w:type="auto"/>
-            <w:vAlign w:val="center"/>
-            <w:hideMark/>
-          </w:tcPr>
-          <w:p>
-            <w:r>
-              <w:rPr>
-                <w:b/>
-                <w:bCs/>
-              </w:rPr>
-              <w:t>Publicación</w:t>
-            </w:r>
-          </w:p>
-        </w:tc>
-        <w:tc>
-          <w:tcPr>
-            <w:tcW w:w="0" w:type="auto"/>
-            <w:vAlign w:val="center"/>
-            <w:hideMark/>
-          </w:tcPr>
-          <w:p>
-            <w:r>
-              <w:t>Implantación final en Support</w:t>
-            </w:r>
-          </w:p>
-        </w:tc>
-        <w:tc>
-          <w:tcPr>
-            <w:tcW w:w="0" w:type="auto"/>
-            <w:vAlign w:val="center"/>
-            <w:hideMark/>
-          </w:tcPr>
-          <w:p>
-            <w:r>
-              <w:t>Pendiente</w:t>
+          <w:p ns2:paraId="41363836" ns2:textId="77777777">
+            <w:r>
+              <w:rPr>
+                <w:b/>
+                <w:bCs/>
+              </w:rPr>
+              <w:t>Prioridad</w:t>
+            </w:r>
+          </w:p>
+        </w:tc>
+        <w:tc>
+          <w:tcPr>
+            <w:tcW w:w="0" w:type="auto"/>
+            <w:vAlign w:val="center"/>
+            <w:hideMark/>
+          </w:tcPr>
+          <w:p ns2:paraId="581740C3" ns2:textId="77777777">
+            <w:r>
+              <w:t>Se prioriza siempre una página visible sobre trabajos técnicos aislados.</w:t>
+            </w:r>
+          </w:p>
+        </w:tc>
+        <w:tc>
+          <w:tcPr>
+            <w:tcW w:w="0" w:type="auto"/>
+            <w:vAlign w:val="center"/>
+            <w:hideMark/>
+          </w:tcPr>
+          <w:p ns2:paraId="0F1C6E2E" ns2:textId="77777777">
+            <w:r>
+              <w:t>Decisión vigente</w:t>
             </w:r>
           </w:p>
         </w:tc>
       </w:tr>
     </w:tbl>
-    <w:p>
+    <w:p ns2:paraId="1AE31BAF" ns2:textId="77777777">
       <w:r>
-        <w:t>La web pública no se ha modificado todavía.</w:t>
+        <w:t>La web pública no se ha modificado; la API se comprobó únicamente en un entorno temporal de prueba.</w:t>
       </w:r>
     </w:p>
-    <w:p>
+    <w:p ns2:paraId="1AE31BAF" ns2:textId="77777777">
       <w:r>
-        <w:pict w14:anchorId="12690276">
-          <v:rect id="_x0000_i1030" style="width:0;height:1.5pt" o:hralign="center" o:hrstd="t" o:hr="t" fillcolor="#a0a0a0" stroked="f"/>
-        </w:pict>
+        <w:t/>
       </w:r>
     </w:p>
-    <w:p>
+    <w:p ns2:paraId="6B579B06" ns2:textId="77777777">
+      <w:pPr>
+        <w:rPr>
+          <w:b/>
+          <w:bCs/>
+        </w:rPr>
+      </w:pPr>
+      <w:r>
+        <w:rPr>
+          <w:b/>
+          <w:bCs/>
+        </w:rPr>
+        <w:t>7. Decisión de proyecto</w:t>
+      </w:r>
+    </w:p>
+    <w:p ns2:paraId="69B59600" ns2:textId="77777777">
+      <w:pPr>
+        <w:numPr>
+          <w:ilvl w:val="0"/>
+          <w:numId w:val="1"/>
+        </w:numPr>
+        <w:rPr>
+          <w:strike/>
+        </w:rPr>
+      </w:pPr>
+      <w:r>
+        <w:rPr>
+          <w:strike/>
+        </w:rPr>
+        <w:t>MySQL se mantiene como fuente activa.</w:t>
+      </w:r>
+    </w:p>
+    <w:p ns2:paraId="69B59600" ns2:textId="77777777">
+      <w:pPr>
+        <w:numPr>
+          <w:ilvl w:val="0"/>
+          <w:numId w:val="1"/>
+        </w:numPr>
+        <w:rPr>
+          <w:strike/>
+        </w:rPr>
+      </w:pPr>
+      <w:r>
+        <w:rPr>
+          <w:strike/>
+        </w:rPr>
+        <w:t>No se cambia a ficheros planos.</w:t>
+      </w:r>
+    </w:p>
+    <w:p ns2:paraId="69B59600" ns2:textId="77777777">
+      <w:pPr>
+        <w:numPr>
+          <w:ilvl w:val="0"/>
+          <w:numId w:val="1"/>
+        </w:numPr>
+        <w:rPr>
+          <w:strike/>
+        </w:rPr>
+      </w:pPr>
+      <w:r>
+        <w:rPr>
+          <w:strike/>
+        </w:rPr>
+        <w:t>No se realizarán más fases o sesiones dedicadas exclusivamente a infraestructura técnica.</w:t>
+      </w:r>
+    </w:p>
+    <w:p ns2:paraId="69B59600" ns2:textId="77777777">
+      <w:pPr>
+        <w:numPr>
+          <w:ilvl w:val="0"/>
+          <w:numId w:val="1"/>
+        </w:numPr>
+        <w:rPr>
+          <w:strike/>
+        </w:rPr>
+      </w:pPr>
+      <w:r>
+        <w:rPr>
+          <w:strike/>
+        </w:rPr>
+        <w:t>A partir de ahora cada tarea debe producir un resultado visible y comprobable en el navegador.</w:t>
+      </w:r>
+    </w:p>
+    <w:p ns2:paraId="69B59600" ns2:textId="77777777">
+      <w:pPr>
+        <w:numPr>
+          <w:ilvl w:val="0"/>
+          <w:numId w:val="1"/>
+        </w:numPr>
+        <w:rPr>
+          <w:strike/>
+        </w:rPr>
+      </w:pPr>
+      <w:r>
+        <w:rPr>
+          <w:strike/>
+        </w:rPr>
+        <w:t>Los cambios internos de API se harán únicamente cuando sean necesarios para construir una página concreta.</w:t>
+      </w:r>
+    </w:p>
+    <w:p ns2:paraId="1AE31BAF" ns2:textId="77777777">
+      <w:r>
+        <w:t/>
+      </w:r>
+    </w:p>
+    <w:p ns2:paraId="6B579B06" ns2:textId="77777777">
+      <w:pPr>
+        <w:rPr>
+          <w:b/>
+          <w:bCs/>
+        </w:rPr>
+      </w:pPr>
+      <w:r>
+        <w:rPr>
+          <w:b/>
+          <w:bCs/>
+        </w:rPr>
+        <w:t>8. Siguiente tarea</w:t>
+      </w:r>
+    </w:p>
+    <w:p ns2:paraId="1AE31BAF" ns2:textId="77777777">
+      <w:r>
+        <w:t>Fase 1D.3–1D.4 — Primera página conectada: Tabla de Datos Consolidados.</w:t>
+      </w:r>
+    </w:p>
+    <w:p ns2:paraId="1AE31BAF" ns2:textId="77777777">
+      <w:r>
+        <w:t>Esta tarea combinará la consulta necesaria de datos y su presentación HTML en una sola entrega visible.</w:t>
+      </w:r>
+    </w:p>
+    <w:p ns2:paraId="1AE31BAF" ns2:textId="77777777">
+      <w:r>
+        <w:t/>
+      </w:r>
+    </w:p>
+    <w:p ns2:paraId="61F57B79" ns2:textId="77777777">
       <w:pPr>
         <w:rPr>
           <w:b/>
@@ -2693,7 +2748,7 @@
         <w:gridCol w:w="2695"/>
         <w:gridCol w:w="3228"/>
       </w:tblGrid>
-      <w:tr>
+      <w:tr ns2:paraId="2FFF9925" ns2:textId="77777777">
         <w:trPr>
           <w:tblHeader/>
           <w:tblCellSpacing w:w="15" w:type="dxa"/>
@@ -2704,7 +2759,7 @@
             <w:vAlign w:val="center"/>
             <w:hideMark/>
           </w:tcPr>
-          <w:p>
+          <w:p ns2:paraId="218EAED8" ns2:textId="77777777">
             <w:pPr>
               <w:rPr>
                 <w:b/>
@@ -2726,7 +2781,7 @@
             <w:vAlign w:val="center"/>
             <w:hideMark/>
           </w:tcPr>
-          <w:p>
+          <w:p ns2:paraId="79D65ECB" ns2:textId="77777777">
             <w:pPr>
               <w:rPr>
                 <w:b/>
@@ -2743,7 +2798,7 @@
           </w:p>
         </w:tc>
       </w:tr>
-      <w:tr>
+      <w:tr ns2:paraId="4A5E6ADA" ns2:textId="77777777">
         <w:trPr>
           <w:tblCellSpacing w:w="15" w:type="dxa"/>
         </w:trPr>
@@ -2753,26 +2808,26 @@
             <w:vAlign w:val="center"/>
             <w:hideMark/>
           </w:tcPr>
-          <w:p>
-            <w:r>
-              <w:t>Plan conceptual</w:t>
-            </w:r>
-          </w:p>
-        </w:tc>
-        <w:tc>
-          <w:tcPr>
-            <w:tcW w:w="0" w:type="auto"/>
-            <w:vAlign w:val="center"/>
-            <w:hideMark/>
-          </w:tcPr>
-          <w:p>
-            <w:r>
-              <w:t>Completado</w:t>
+          <w:p ns2:paraId="7BA2DC9B" ns2:textId="77777777">
+            <w:r>
+              <w:t>Fase 1C</w:t>
+            </w:r>
+          </w:p>
+        </w:tc>
+        <w:tc>
+          <w:tcPr>
+            <w:tcW w:w="0" w:type="auto"/>
+            <w:vAlign w:val="center"/>
+            <w:hideMark/>
+          </w:tcPr>
+          <w:p ns2:paraId="31F6210B" ns2:textId="77777777">
+            <w:r>
+              <w:t>Finalizada — GO</w:t>
             </w:r>
           </w:p>
         </w:tc>
       </w:tr>
-      <w:tr>
+      <w:tr ns2:paraId="4A5E6ADA" ns2:textId="77777777">
         <w:trPr>
           <w:tblCellSpacing w:w="15" w:type="dxa"/>
         </w:trPr>
@@ -2782,26 +2837,26 @@
             <w:vAlign w:val="center"/>
             <w:hideMark/>
           </w:tcPr>
-          <w:p>
-            <w:r>
-              <w:t>Maestro territorial</w:t>
-            </w:r>
-          </w:p>
-        </w:tc>
-        <w:tc>
-          <w:tcPr>
-            <w:tcW w:w="0" w:type="auto"/>
-            <w:vAlign w:val="center"/>
-            <w:hideMark/>
-          </w:tcPr>
-          <w:p>
-            <w:r>
-              <w:t>Completado</w:t>
+          <w:p ns2:paraId="7BA2DC9B" ns2:textId="77777777">
+            <w:r>
+              <w:t>RG2025_V1</w:t>
+            </w:r>
+          </w:p>
+        </w:tc>
+        <w:tc>
+          <w:tcPr>
+            <w:tcW w:w="0" w:type="auto"/>
+            <w:vAlign w:val="center"/>
+            <w:hideMark/>
+          </w:tcPr>
+          <w:p ns2:paraId="31F6210B" ns2:textId="77777777">
+            <w:r>
+              <w:t>Congelada y activa en MySQL; 9/244/8/27/243, sin duplicidades ni datos activos sin fuente</w:t>
             </w:r>
           </w:p>
         </w:tc>
       </w:tr>
-      <w:tr>
+      <w:tr ns2:paraId="4A5E6ADA" ns2:textId="77777777">
         <w:trPr>
           <w:tblCellSpacing w:w="15" w:type="dxa"/>
         </w:trPr>
@@ -2811,26 +2866,26 @@
             <w:vAlign w:val="center"/>
             <w:hideMark/>
           </w:tcPr>
-          <w:p>
-            <w:r>
-              <w:t>Territorio y población</w:t>
-            </w:r>
-          </w:p>
-        </w:tc>
-        <w:tc>
-          <w:tcPr>
-            <w:tcW w:w="0" w:type="auto"/>
-            <w:vAlign w:val="center"/>
-            <w:hideMark/>
-          </w:tcPr>
-          <w:p>
-            <w:r>
-              <w:t>Completado</w:t>
+          <w:p ns2:paraId="7BA2DC9B" ns2:textId="77777777">
+            <w:r>
+              <w:t>Fase 1D.1</w:t>
+            </w:r>
+          </w:p>
+        </w:tc>
+        <w:tc>
+          <w:tcPr>
+            <w:tcW w:w="0" w:type="auto"/>
+            <w:vAlign w:val="center"/>
+            <w:hideMark/>
+          </w:tcPr>
+          <w:p ns2:paraId="31F6210B" ns2:textId="77777777">
+            <w:r>
+              <w:t>Diagnóstico y contrato finalizados — GO</w:t>
             </w:r>
           </w:p>
         </w:tc>
       </w:tr>
-      <w:tr>
+      <w:tr ns2:paraId="4A5E6ADA" ns2:textId="77777777">
         <w:trPr>
           <w:tblCellSpacing w:w="15" w:type="dxa"/>
         </w:trPr>
@@ -2840,26 +2895,26 @@
             <w:vAlign w:val="center"/>
             <w:hideMark/>
           </w:tcPr>
-          <w:p>
-            <w:r>
-              <w:t>Implantación MySQL inicial</w:t>
-            </w:r>
-          </w:p>
-        </w:tc>
-        <w:tc>
-          <w:tcPr>
-            <w:tcW w:w="0" w:type="auto"/>
-            <w:vAlign w:val="center"/>
-            <w:hideMark/>
-          </w:tcPr>
-          <w:p>
-            <w:r>
-              <w:t>Completada</w:t>
+          <w:p ns2:paraId="7BA2DC9B" ns2:textId="77777777">
+            <w:r>
+              <w:t>Fase 1D.2</w:t>
+            </w:r>
+          </w:p>
+        </w:tc>
+        <w:tc>
+          <w:tcPr>
+            <w:tcW w:w="0" w:type="auto"/>
+            <w:vAlign w:val="center"/>
+            <w:hideMark/>
+          </w:tcPr>
+          <w:p ns2:paraId="31F6210B" ns2:textId="77777777">
+            <w:r>
+              <w:t>API mínima validada — GO operativo condicionado</w:t>
             </w:r>
           </w:p>
         </w:tc>
       </w:tr>
-      <w:tr>
+      <w:tr ns2:paraId="4A5E6ADA" ns2:textId="77777777">
         <w:trPr>
           <w:tblCellSpacing w:w="15" w:type="dxa"/>
         </w:trPr>
@@ -2869,26 +2924,26 @@
             <w:vAlign w:val="center"/>
             <w:hideMark/>
           </w:tcPr>
-          <w:p>
-            <w:r>
-              <w:t>Economía</w:t>
-            </w:r>
-          </w:p>
-        </w:tc>
-        <w:tc>
-          <w:tcPr>
-            <w:tcW w:w="0" w:type="auto"/>
-            <w:vAlign w:val="center"/>
-            <w:hideMark/>
-          </w:tcPr>
-          <w:p>
-            <w:r>
-              <w:t>Completada</w:t>
+          <w:p ns2:paraId="7BA2DC9B" ns2:textId="77777777">
+            <w:r>
+              <w:t>Pendiente para producción</w:t>
+            </w:r>
+          </w:p>
+        </w:tc>
+        <w:tc>
+          <w:tcPr>
+            <w:tcW w:w="0" w:type="auto"/>
+            <w:vAlign w:val="center"/>
+            <w:hideMark/>
+          </w:tcPr>
+          <w:p ns2:paraId="31F6210B" ns2:textId="77777777">
+            <w:r>
+              <w:t>Usuario MySQL exclusivamente de lectura</w:t>
             </w:r>
           </w:p>
         </w:tc>
       </w:tr>
-      <w:tr>
+      <w:tr ns2:paraId="4A5E6ADA" ns2:textId="77777777">
         <w:trPr>
           <w:tblCellSpacing w:w="15" w:type="dxa"/>
         </w:trPr>
@@ -2898,26 +2953,26 @@
             <w:vAlign w:val="center"/>
             <w:hideMark/>
           </w:tcPr>
-          <w:p>
-            <w:r>
-              <w:t>Desarrollo humano</w:t>
-            </w:r>
-          </w:p>
-        </w:tc>
-        <w:tc>
-          <w:tcPr>
-            <w:tcW w:w="0" w:type="auto"/>
-            <w:vAlign w:val="center"/>
-            <w:hideMark/>
-          </w:tcPr>
-          <w:p>
-            <w:r>
-              <w:t>Preparado, pendiente de ejecutar</w:t>
+          <w:p ns2:paraId="7BA2DC9B" ns2:textId="77777777">
+            <w:r>
+              <w:t>Aplicación web</w:t>
+            </w:r>
+          </w:p>
+        </w:tc>
+        <w:tc>
+          <w:tcPr>
+            <w:tcW w:w="0" w:type="auto"/>
+            <w:vAlign w:val="center"/>
+            <w:hideMark/>
+          </w:tcPr>
+          <w:p ns2:paraId="31F6210B" ns2:textId="77777777">
+            <w:r>
+              <w:t>Conexión con MySQL en curso</w:t>
             </w:r>
           </w:p>
         </w:tc>
       </w:tr>
-      <w:tr>
+      <w:tr ns2:paraId="4A5E6ADA" ns2:textId="77777777">
         <w:trPr>
           <w:tblCellSpacing w:w="15" w:type="dxa"/>
         </w:trPr>
@@ -2927,85 +2982,27 @@
             <w:vAlign w:val="center"/>
             <w:hideMark/>
           </w:tcPr>
-          <w:p>
-            <w:r>
-              <w:t>Militar, energía y tecnología</w:t>
-            </w:r>
-          </w:p>
-        </w:tc>
-        <w:tc>
-          <w:tcPr>
-            <w:tcW w:w="0" w:type="auto"/>
-            <w:vAlign w:val="center"/>
-            <w:hideMark/>
-          </w:tcPr>
-          <w:p>
-            <w:r>
-              <w:t>Pendientes</w:t>
-            </w:r>
-          </w:p>
-        </w:tc>
-      </w:tr>
-      <w:tr>
-        <w:trPr>
-          <w:tblCellSpacing w:w="15" w:type="dxa"/>
-        </w:trPr>
-        <w:tc>
-          <w:tcPr>
-            <w:tcW w:w="0" w:type="auto"/>
-            <w:vAlign w:val="center"/>
-            <w:hideMark/>
-          </w:tcPr>
-          <w:p>
-            <w:r>
-              <w:t>Diseño y programación web</w:t>
-            </w:r>
-          </w:p>
-        </w:tc>
-        <w:tc>
-          <w:tcPr>
-            <w:tcW w:w="0" w:type="auto"/>
-            <w:vAlign w:val="center"/>
-            <w:hideMark/>
-          </w:tcPr>
-          <w:p>
-            <w:r>
-              <w:t>Pendientes</w:t>
-            </w:r>
-          </w:p>
-        </w:tc>
-      </w:tr>
-      <w:tr>
-        <w:trPr>
-          <w:tblCellSpacing w:w="15" w:type="dxa"/>
-        </w:trPr>
-        <w:tc>
-          <w:tcPr>
-            <w:tcW w:w="0" w:type="auto"/>
-            <w:vAlign w:val="center"/>
-            <w:hideMark/>
-          </w:tcPr>
-          <w:p>
-            <w:r>
-              <w:t>Publicación final</w:t>
-            </w:r>
-          </w:p>
-        </w:tc>
-        <w:tc>
-          <w:tcPr>
-            <w:tcW w:w="0" w:type="auto"/>
-            <w:vAlign w:val="center"/>
-            <w:hideMark/>
-          </w:tcPr>
-          <w:p>
-            <w:r>
-              <w:t>Pendiente</w:t>
+          <w:p ns2:paraId="7BA2DC9B" ns2:textId="77777777">
+            <w:r>
+              <w:t>Siguiente entrega</w:t>
+            </w:r>
+          </w:p>
+        </w:tc>
+        <w:tc>
+          <w:tcPr>
+            <w:tcW w:w="0" w:type="auto"/>
+            <w:vAlign w:val="center"/>
+            <w:hideMark/>
+          </w:tcPr>
+          <w:p ns2:paraId="31F6210B" ns2:textId="77777777">
+            <w:r>
+              <w:t>Tabla de Datos Consolidados conectada</w:t>
             </w:r>
           </w:p>
         </w:tc>
       </w:tr>
     </w:tbl>
-    <w:p>
+    <w:p ns2:paraId="6B579B06" ns2:textId="77777777">
       <w:pPr>
         <w:rPr>
           <w:b/>
@@ -3017,10 +3014,14 @@
           <w:b/>
           <w:bCs/>
         </w:rPr>
-        <w:t>Punto exacto donde se ha detenido</w:t>
+        <w:t>Punto exacto donde se continúa</w:t>
       </w:r>
     </w:p>
-    <w:p/>
+    <w:p ns2:paraId="1AE31BAF" ns2:textId="77777777">
+      <w:r>
+        <w:t>Fase 1D.3–1D.4 — construir y presentar en el navegador la Tabla de Datos Consolidados con datos reales de RG2025_V1.</w:t>
+      </w:r>
+    </w:p>
     <w:sectPr>
       <w:pgSz w:w="11906" w:h="16838"/>
       <w:pgMar w:top="1417" w:right="1701" w:bottom="1417" w:left="1701" w:header="708" w:footer="708" w:gutter="0"/>

</xml_diff>